<commit_message>
Json -> python updated
</commit_message>
<xml_diff>
--- a/Project Guidlines.docx
+++ b/Project Guidlines.docx
@@ -60,7 +60,6 @@
                 <w:showingPlcHdr/>
                 <w15:appearance w15:val="hidden"/>
               </w:sdtPr>
-              <w:sdtEndPr/>
               <w:sdtContent>
                 <w:r>
                   <w:t>Project Summary</w:t>
@@ -121,7 +120,6 @@
                 <w:showingPlcHdr/>
                 <w15:appearance w15:val="hidden"/>
               </w:sdtPr>
-              <w:sdtEndPr/>
               <w:sdtContent>
                 <w:r>
                   <w:t>Report Date</w:t>
@@ -149,7 +147,6 @@
                 <w:showingPlcHdr/>
                 <w15:appearance w15:val="hidden"/>
               </w:sdtPr>
-              <w:sdtEndPr/>
               <w:sdtContent>
                 <w:r>
                   <w:t>Project Name</w:t>
@@ -177,7 +174,6 @@
                 <w:showingPlcHdr/>
                 <w15:appearance w15:val="hidden"/>
               </w:sdtPr>
-              <w:sdtEndPr/>
               <w:sdtContent>
                 <w:r>
                   <w:t>Prepared By</w:t>
@@ -273,7 +269,6 @@
                 <w:showingPlcHdr/>
                 <w15:appearance w15:val="hidden"/>
               </w:sdtPr>
-              <w:sdtEndPr/>
               <w:sdtContent>
                 <w:r>
                   <w:t>Status</w:t>
@@ -418,7 +413,6 @@
                 <w:showingPlcHdr/>
                 <w15:appearance w15:val="hidden"/>
               </w:sdtPr>
-              <w:sdtEndPr/>
               <w:sdtContent>
                 <w:r>
                   <w:t>task</w:t>
@@ -446,7 +440,6 @@
                 <w:showingPlcHdr/>
                 <w15:appearance w15:val="hidden"/>
               </w:sdtPr>
-              <w:sdtEndPr/>
               <w:sdtContent>
                 <w:r>
                   <w:t>notes</w:t>
@@ -740,7 +733,6 @@
                 <w:showingPlcHdr/>
                 <w15:appearance w15:val="hidden"/>
               </w:sdtPr>
-              <w:sdtEndPr/>
               <w:sdtContent>
                 <w:r>
                   <w:t>task</w:t>
@@ -768,7 +760,6 @@
                 <w:showingPlcHdr/>
                 <w15:appearance w15:val="hidden"/>
               </w:sdtPr>
-              <w:sdtEndPr/>
               <w:sdtContent>
                 <w:r>
                   <w:t>notes</w:t>
@@ -1226,7 +1217,6 @@
                 <w:showingPlcHdr/>
                 <w15:appearance w15:val="hidden"/>
               </w:sdtPr>
-              <w:sdtEndPr/>
               <w:sdtContent>
                 <w:r>
                   <w:t>task</w:t>
@@ -1254,7 +1244,6 @@
                 <w:showingPlcHdr/>
                 <w15:appearance w15:val="hidden"/>
               </w:sdtPr>
-              <w:sdtEndPr/>
               <w:sdtContent>
                 <w:r>
                   <w:t>notes</w:t>
@@ -1532,7 +1521,6 @@
                 <w:showingPlcHdr/>
                 <w15:appearance w15:val="hidden"/>
               </w:sdtPr>
-              <w:sdtEndPr/>
               <w:sdtContent>
                 <w:r>
                   <w:t>task</w:t>
@@ -1560,7 +1548,6 @@
                 <w:showingPlcHdr/>
                 <w15:appearance w15:val="hidden"/>
               </w:sdtPr>
-              <w:sdtEndPr/>
               <w:sdtContent>
                 <w:r>
                   <w:t>notes</w:t>
@@ -1893,19 +1880,7 @@
     </w:p>
     <w:p>
       <w:r>
-        <w:t>Object-Oriented Finite Element Programming:</w:t>
-      </w:r>
-      <w:r>
-        <w:t xml:space="preserve"> </w:t>
-      </w:r>
-      <w:r>
-        <w:t>Frameworks for Analysis, Algorithms and Parallel</w:t>
-      </w:r>
-      <w:r>
-        <w:t xml:space="preserve"> </w:t>
-      </w:r>
-      <w:r>
-        <w:t>Computing</w:t>
+        <w:t>Object-Oriented Finite Element Programming: Frameworks for Analysis, Algorithms and Parallel Computing</w:t>
       </w:r>
     </w:p>
     <w:p>
@@ -1936,8 +1911,6 @@
       <w:pPr>
         <w:pStyle w:val="Heading1"/>
       </w:pPr>
-      <w:bookmarkStart w:id="0" w:name="_GoBack"/>
-      <w:bookmarkEnd w:id="0"/>
     </w:p>
     <w:p>
       <w:pPr>
@@ -1969,13 +1942,148 @@
       </w:r>
     </w:p>
     <w:p>
+      <w:proofErr w:type="spellStart"/>
       <w:r>
-        <w:t>OpenSeesPy Frame Analysis</w:t>
+        <w:t>OpenSeesPy</w:t>
+      </w:r>
+      <w:proofErr w:type="spellEnd"/>
+      <w:r>
+        <w:t xml:space="preserve"> Frame Analysis</w:t>
       </w:r>
     </w:p>
+    <w:p>
+      <w:r>
+        <w:rPr>
+          <w:noProof/>
+        </w:rPr>
+        <w:drawing>
+          <wp:anchor distT="0" distB="0" distL="114300" distR="114300" simplePos="0" relativeHeight="251659264" behindDoc="1" locked="0" layoutInCell="1" allowOverlap="1" wp14:anchorId="3D12808E" wp14:editId="09DA9D3C">
+            <wp:simplePos x="0" y="0"/>
+            <wp:positionH relativeFrom="column">
+              <wp:posOffset>167640</wp:posOffset>
+            </wp:positionH>
+            <wp:positionV relativeFrom="paragraph">
+              <wp:posOffset>207010</wp:posOffset>
+            </wp:positionV>
+            <wp:extent cx="6881495" cy="1833245"/>
+            <wp:effectExtent l="0" t="0" r="0" b="0"/>
+            <wp:wrapSquare wrapText="bothSides"/>
+            <wp:docPr id="5" name="Picture 5"/>
+            <wp:cNvGraphicFramePr>
+              <a:graphicFrameLocks xmlns:a="http://schemas.openxmlformats.org/drawingml/2006/main" noChangeAspect="1"/>
+            </wp:cNvGraphicFramePr>
+            <a:graphic xmlns:a="http://schemas.openxmlformats.org/drawingml/2006/main">
+              <a:graphicData uri="http://schemas.openxmlformats.org/drawingml/2006/picture">
+                <pic:pic xmlns:pic="http://schemas.openxmlformats.org/drawingml/2006/picture">
+                  <pic:nvPicPr>
+                    <pic:cNvPr id="0" name="Picture 2"/>
+                    <pic:cNvPicPr>
+                      <a:picLocks noChangeAspect="1" noChangeArrowheads="1"/>
+                    </pic:cNvPicPr>
+                  </pic:nvPicPr>
+                  <pic:blipFill>
+                    <a:blip r:embed="rId13">
+                      <a:extLst>
+                        <a:ext uri="{28A0092B-C50C-407E-A947-70E740481C1C}">
+                          <a14:useLocalDpi xmlns:a14="http://schemas.microsoft.com/office/drawing/2010/main" val="0"/>
+                        </a:ext>
+                      </a:extLst>
+                    </a:blip>
+                    <a:srcRect/>
+                    <a:stretch>
+                      <a:fillRect/>
+                    </a:stretch>
+                  </pic:blipFill>
+                  <pic:spPr bwMode="auto">
+                    <a:xfrm>
+                      <a:off x="0" y="0"/>
+                      <a:ext cx="6881495" cy="1833245"/>
+                    </a:xfrm>
+                    <a:prstGeom prst="rect">
+                      <a:avLst/>
+                    </a:prstGeom>
+                    <a:noFill/>
+                    <a:ln>
+                      <a:noFill/>
+                    </a:ln>
+                  </pic:spPr>
+                </pic:pic>
+              </a:graphicData>
+            </a:graphic>
+            <wp14:sizeRelH relativeFrom="margin">
+              <wp14:pctWidth>0</wp14:pctWidth>
+            </wp14:sizeRelH>
+            <wp14:sizeRelV relativeFrom="margin">
+              <wp14:pctHeight>0</wp14:pctHeight>
+            </wp14:sizeRelV>
+          </wp:anchor>
+        </w:drawing>
+      </w:r>
+    </w:p>
+    <w:p/>
+    <w:p>
+      <w:pPr>
+        <w:jc w:val="center"/>
+      </w:pPr>
+      <w:r>
+        <w:rPr>
+          <w:noProof/>
+        </w:rPr>
+        <w:drawing>
+          <wp:inline distT="0" distB="0" distL="0" distR="0" wp14:anchorId="63D34A9F" wp14:editId="3BE29931">
+            <wp:extent cx="1768640" cy="3268980"/>
+            <wp:effectExtent l="0" t="0" r="3175" b="7620"/>
+            <wp:docPr id="4" name="Picture 4"/>
+            <wp:cNvGraphicFramePr>
+              <a:graphicFrameLocks xmlns:a="http://schemas.openxmlformats.org/drawingml/2006/main" noChangeAspect="1"/>
+            </wp:cNvGraphicFramePr>
+            <a:graphic xmlns:a="http://schemas.openxmlformats.org/drawingml/2006/main">
+              <a:graphicData uri="http://schemas.openxmlformats.org/drawingml/2006/picture">
+                <pic:pic xmlns:pic="http://schemas.openxmlformats.org/drawingml/2006/picture">
+                  <pic:nvPicPr>
+                    <pic:cNvPr id="0" name="Picture 1"/>
+                    <pic:cNvPicPr>
+                      <a:picLocks noChangeAspect="1" noChangeArrowheads="1"/>
+                    </pic:cNvPicPr>
+                  </pic:nvPicPr>
+                  <pic:blipFill>
+                    <a:blip r:embed="rId14">
+                      <a:extLst>
+                        <a:ext uri="{28A0092B-C50C-407E-A947-70E740481C1C}">
+                          <a14:useLocalDpi xmlns:a14="http://schemas.microsoft.com/office/drawing/2010/main" val="0"/>
+                        </a:ext>
+                      </a:extLst>
+                    </a:blip>
+                    <a:srcRect/>
+                    <a:stretch>
+                      <a:fillRect/>
+                    </a:stretch>
+                  </pic:blipFill>
+                  <pic:spPr bwMode="auto">
+                    <a:xfrm>
+                      <a:off x="0" y="0"/>
+                      <a:ext cx="1778277" cy="3286792"/>
+                    </a:xfrm>
+                    <a:prstGeom prst="rect">
+                      <a:avLst/>
+                    </a:prstGeom>
+                    <a:noFill/>
+                    <a:ln>
+                      <a:noFill/>
+                    </a:ln>
+                  </pic:spPr>
+                </pic:pic>
+              </a:graphicData>
+            </a:graphic>
+          </wp:inline>
+        </w:drawing>
+      </w:r>
+      <w:bookmarkStart w:id="0" w:name="_GoBack"/>
+      <w:bookmarkEnd w:id="0"/>
+    </w:p>
     <w:sectPr>
-      <w:footerReference w:type="default" r:id="rId13"/>
-      <w:footerReference w:type="first" r:id="rId14"/>
+      <w:footerReference w:type="default" r:id="rId15"/>
+      <w:footerReference w:type="first" r:id="rId16"/>
       <w:pgSz w:w="12240" w:h="15840" w:code="1"/>
       <w:pgMar w:top="360" w:right="360" w:bottom="360" w:left="360" w:header="864" w:footer="720" w:gutter="0"/>
       <w:cols w:space="720"/>
@@ -5351,6 +5459,7 @@
     <w:rsid w:val="002063D2"/>
     <w:rsid w:val="00A00DE0"/>
     <w:rsid w:val="00A95178"/>
+    <w:rsid w:val="00B40845"/>
   </w:rsids>
   <m:mathPr>
     <m:mathFont m:val="Cambria Math"/>
@@ -6254,7 +6363,7 @@
 </file>
 
 <file path=customXml/itemProps1.xml><?xml version="1.0" encoding="utf-8"?>
-<ds:datastoreItem xmlns:ds="http://schemas.openxmlformats.org/officeDocument/2006/customXml" ds:itemID="{EEBA820E-FF02-468D-B329-A3FBAD592199}">
+<ds:datastoreItem xmlns:ds="http://schemas.openxmlformats.org/officeDocument/2006/customXml" ds:itemID="{19BFF849-B454-4EC1-8C70-57C9640C941F}">
   <ds:schemaRefs>
     <ds:schemaRef ds:uri="http://schemas.openxmlformats.org/officeDocument/2006/bibliography"/>
   </ds:schemaRefs>

</xml_diff>

<commit_message>
Backend is Completed (Flask) -> Frontend is Connected to Backend -> Analysis Module Completed
</commit_message>
<xml_diff>
--- a/Project Guidlines.docx
+++ b/Project Guidlines.docx
@@ -60,10 +60,13 @@
                 <w:showingPlcHdr/>
                 <w15:appearance w15:val="hidden"/>
               </w:sdtPr>
+              <w:sdtEndPr/>
               <w:sdtContent>
+                <w:bookmarkStart w:id="0" w:name="_GoBack"/>
                 <w:r>
                   <w:t>Project Summary</w:t>
                 </w:r>
+                <w:bookmarkEnd w:id="0"/>
               </w:sdtContent>
             </w:sdt>
           </w:p>
@@ -120,6 +123,7 @@
                 <w:showingPlcHdr/>
                 <w15:appearance w15:val="hidden"/>
               </w:sdtPr>
+              <w:sdtEndPr/>
               <w:sdtContent>
                 <w:r>
                   <w:t>Report Date</w:t>
@@ -147,6 +151,7 @@
                 <w:showingPlcHdr/>
                 <w15:appearance w15:val="hidden"/>
               </w:sdtPr>
+              <w:sdtEndPr/>
               <w:sdtContent>
                 <w:r>
                   <w:t>Project Name</w:t>
@@ -174,6 +179,7 @@
                 <w:showingPlcHdr/>
                 <w15:appearance w15:val="hidden"/>
               </w:sdtPr>
+              <w:sdtEndPr/>
               <w:sdtContent>
                 <w:r>
                   <w:t>Prepared By</w:t>
@@ -269,6 +275,7 @@
                 <w:showingPlcHdr/>
                 <w15:appearance w15:val="hidden"/>
               </w:sdtPr>
+              <w:sdtEndPr/>
               <w:sdtContent>
                 <w:r>
                   <w:t>Status</w:t>
@@ -413,6 +420,7 @@
                 <w:showingPlcHdr/>
                 <w15:appearance w15:val="hidden"/>
               </w:sdtPr>
+              <w:sdtEndPr/>
               <w:sdtContent>
                 <w:r>
                   <w:t>task</w:t>
@@ -440,6 +448,7 @@
                 <w:showingPlcHdr/>
                 <w15:appearance w15:val="hidden"/>
               </w:sdtPr>
+              <w:sdtEndPr/>
               <w:sdtContent>
                 <w:r>
                   <w:t>notes</w:t>
@@ -484,22 +493,6 @@
               <w:t xml:space="preserve"> and Core Concept</w:t>
             </w:r>
           </w:p>
-          <w:p>
-            <w:pPr>
-              <w:tabs>
-                <w:tab w:val="left" w:pos="1224"/>
-              </w:tabs>
-              <w:rPr>
-                <w:b/>
-              </w:rPr>
-            </w:pPr>
-            <w:r>
-              <w:rPr>
-                <w:b/>
-              </w:rPr>
-              <w:tab/>
-            </w:r>
-          </w:p>
         </w:tc>
         <w:tc>
           <w:tcPr>
@@ -588,7 +581,7 @@
               <w:rPr>
                 <w:b/>
               </w:rPr>
-              <w:t>Flask</w:t>
+              <w:t>React</w:t>
             </w:r>
           </w:p>
         </w:tc>
@@ -605,7 +598,21 @@
               </w:numPr>
             </w:pPr>
             <w:r>
-              <w:t>Receive JSON truss data (nodes, elements, loads)</w:t>
+              <w:t>Handle</w:t>
+            </w:r>
+            <w:r>
+              <w:t xml:space="preserve"> JSON truss data (nodes, elements, loads</w:t>
+            </w:r>
+            <w:r>
+              <w:t xml:space="preserve">, material, </w:t>
+            </w:r>
+            <w:proofErr w:type="spellStart"/>
+            <w:r>
+              <w:t>analizer</w:t>
+            </w:r>
+            <w:proofErr w:type="spellEnd"/>
+            <w:r>
+              <w:t>)</w:t>
             </w:r>
           </w:p>
           <w:p>
@@ -733,6 +740,7 @@
                 <w:showingPlcHdr/>
                 <w15:appearance w15:val="hidden"/>
               </w:sdtPr>
+              <w:sdtEndPr/>
               <w:sdtContent>
                 <w:r>
                   <w:t>task</w:t>
@@ -760,6 +768,7 @@
                 <w:showingPlcHdr/>
                 <w15:appearance w15:val="hidden"/>
               </w:sdtPr>
+              <w:sdtEndPr/>
               <w:sdtContent>
                 <w:r>
                   <w:t>notes</w:t>
@@ -1112,7 +1121,7 @@
               </w:rPr>
             </w:pPr>
             <w:r>
-              <w:t>Displacements, reactions, element forces, eigenvalues.</w:t>
+              <w:t>Displacements, reactions, element forces.</w:t>
             </w:r>
           </w:p>
         </w:tc>
@@ -1217,6 +1226,7 @@
                 <w:showingPlcHdr/>
                 <w15:appearance w15:val="hidden"/>
               </w:sdtPr>
+              <w:sdtEndPr/>
               <w:sdtContent>
                 <w:r>
                   <w:t>task</w:t>
@@ -1244,6 +1254,7 @@
                 <w:showingPlcHdr/>
                 <w15:appearance w15:val="hidden"/>
               </w:sdtPr>
+              <w:sdtEndPr/>
               <w:sdtContent>
                 <w:r>
                   <w:t>notes</w:t>
@@ -1359,7 +1370,13 @@
               <w:rPr>
                 <w:lang w:val="en-IN"/>
               </w:rPr>
-              <w:t>: Flask (lightweight) + Celery</w:t>
+              <w:t xml:space="preserve">: </w:t>
+            </w:r>
+            <w:r>
+              <w:rPr>
+                <w:lang w:val="en-IN"/>
+              </w:rPr>
+              <w:t>Django + Socket</w:t>
             </w:r>
           </w:p>
           <w:p>
@@ -1384,7 +1401,31 @@
               <w:rPr>
                 <w:lang w:val="en-IN"/>
               </w:rPr>
-              <w:t xml:space="preserve">: React + Fabric.js (2D) </w:t>
+              <w:t>: React +</w:t>
+            </w:r>
+            <w:r>
+              <w:rPr>
+                <w:lang w:val="en-IN"/>
+              </w:rPr>
+              <w:t>Three.</w:t>
+            </w:r>
+            <w:r>
+              <w:rPr>
+                <w:lang w:val="en-IN"/>
+              </w:rPr>
+              <w:t>js (2D</w:t>
+            </w:r>
+            <w:r>
+              <w:rPr>
+                <w:lang w:val="en-IN"/>
+              </w:rPr>
+              <w:t>/3D)</w:t>
+            </w:r>
+            <w:r>
+              <w:rPr>
+                <w:lang w:val="en-IN"/>
+              </w:rPr>
+              <w:t xml:space="preserve"> </w:t>
             </w:r>
             <w:r>
               <w:rPr>
@@ -1521,6 +1562,7 @@
                 <w:showingPlcHdr/>
                 <w15:appearance w15:val="hidden"/>
               </w:sdtPr>
+              <w:sdtEndPr/>
               <w:sdtContent>
                 <w:r>
                   <w:t>task</w:t>
@@ -1548,6 +1590,7 @@
                 <w:showingPlcHdr/>
                 <w15:appearance w15:val="hidden"/>
               </w:sdtPr>
+              <w:sdtEndPr/>
               <w:sdtContent>
                 <w:r>
                   <w:t>notes</w:t>
@@ -1628,21 +1671,13 @@
               <w:rPr>
                 <w:lang w:val="en-IN"/>
               </w:rPr>
-              <w:t xml:space="preserve"> scripts with </w:t>
-            </w:r>
-            <w:proofErr w:type="spellStart"/>
+              <w:t xml:space="preserve"> scripts </w:t>
+            </w:r>
             <w:r>
               <w:rPr>
                 <w:lang w:val="en-IN"/>
               </w:rPr>
-              <w:t>ndm</w:t>
-            </w:r>
-            <w:proofErr w:type="spellEnd"/>
-            <w:r>
-              <w:rPr>
-                <w:lang w:val="en-IN"/>
-              </w:rPr>
-              <w:t xml:space="preserve"> 3</w:t>
+              <w:t>with Fem and Material</w:t>
             </w:r>
           </w:p>
           <w:p/>
@@ -2078,8 +2113,6 @@
           </wp:inline>
         </w:drawing>
       </w:r>
-      <w:bookmarkStart w:id="0" w:name="_GoBack"/>
-      <w:bookmarkEnd w:id="0"/>
     </w:p>
     <w:sectPr>
       <w:footerReference w:type="default" r:id="rId15"/>
@@ -5457,6 +5490,7 @@
   <w:rsids>
     <w:rsidRoot w:val="002063D2"/>
     <w:rsid w:val="002063D2"/>
+    <w:rsid w:val="003374DC"/>
     <w:rsid w:val="00A00DE0"/>
     <w:rsid w:val="00A95178"/>
     <w:rsid w:val="00B40845"/>
@@ -6363,7 +6397,7 @@
 </file>
 
 <file path=customXml/itemProps1.xml><?xml version="1.0" encoding="utf-8"?>
-<ds:datastoreItem xmlns:ds="http://schemas.openxmlformats.org/officeDocument/2006/customXml" ds:itemID="{19BFF849-B454-4EC1-8C70-57C9640C941F}">
+<ds:datastoreItem xmlns:ds="http://schemas.openxmlformats.org/officeDocument/2006/customXml" ds:itemID="{7BA72FC6-ED00-42EE-A084-BF743B017F62}">
   <ds:schemaRefs>
     <ds:schemaRef ds:uri="http://schemas.openxmlformats.org/officeDocument/2006/bibliography"/>
   </ds:schemaRefs>

</xml_diff>